<commit_message>
cv: actualizar datos, reestructurar y corregir salida de generate_cv.py
Datos actualizados (ES+EN):
- Carrera: Ingenieria en Software, 9no semestre (de 10)
- Promedio: 8.98 -> 9.01/10
- Certificados Google: 2026 en progreso, sin detalle de avance
- Fechas reales: EcuaInventario Feb. 2026, Freelance Jul. 2025,
  practicantado Feb. 2026 - Jul. 2026
- Agregado curso Ethical Hacking Red Team (8h, Hacker Mentor, 2023)

Reestructura:
- Experiencia va antes de Educacion
- Nuevo bloque Perfil de 2 lineas al inicio
- ApplyJob reencuadrado a lo tecnico: sin "auto-postulacion" ni
  nombres de ATS (el CV se envia por esos mismos ATS)
- Habilidades: Kali Linux sin "(aprendizaje activo)"

Fix: generate_cv.py escribia en cv_harvard_es/en.docx, nombres que no
consume nadie; ahora genera cv_es.docx y cv_en.docx, que son los que
apuntan CV_PATH y CV_PATH_EN.
</commit_message>
<xml_diff>
--- a/profile/cv_en.docx
+++ b/profile/cv_en.docx
@@ -59,77 +59,7 @@
           <w:i w:val="0"/>
           <w:sz w:val="22"/>
         </w:rPr>
-        <w:t>EDUCATION</w:t>
-      </w:r>
-    </w:p>
-    <w:p>
-      <w:pPr>
-        <w:tabs>
-          <w:tab w:val="right" w:pos="11030"/>
-        </w:tabs>
-        <w:spacing w:before="80" w:after="0" w:line="240" w:lineRule="exact"/>
-      </w:pPr>
-      <w:r>
-        <w:rPr>
-          <w:rFonts w:ascii="Calibri" w:hAnsi="Calibri"/>
-          <w:b/>
-          <w:i w:val="0"/>
-          <w:sz w:val="22"/>
-        </w:rPr>
-        <w:t>University of Guayaquil</w:t>
-      </w:r>
-      <w:r>
-        <w:rPr>
-          <w:rFonts w:ascii="Calibri" w:hAnsi="Calibri"/>
-          <w:b w:val="0"/>
-          <w:i w:val="0"/>
-          <w:sz w:val="22"/>
-        </w:rPr>
-        <w:tab/>
-      </w:r>
-      <w:r>
-        <w:rPr>
-          <w:rFonts w:ascii="Calibri" w:hAnsi="Calibri"/>
-          <w:b w:val="0"/>
-          <w:i w:val="0"/>
-          <w:sz w:val="22"/>
-        </w:rPr>
-        <w:t>Guayaquil, Ecuador</w:t>
-      </w:r>
-    </w:p>
-    <w:p>
-      <w:pPr>
-        <w:tabs>
-          <w:tab w:val="right" w:pos="11030"/>
-        </w:tabs>
-        <w:spacing w:before="0" w:after="0" w:line="240" w:lineRule="exact"/>
-      </w:pPr>
-      <w:r>
-        <w:rPr>
-          <w:rFonts w:ascii="Calibri" w:hAnsi="Calibri"/>
-          <w:b w:val="0"/>
-          <w:i/>
-          <w:sz w:val="22"/>
-        </w:rPr>
-        <w:t>B.Sc. Software Engineering — 9th semester (of 10)</w:t>
-      </w:r>
-      <w:r>
-        <w:rPr>
-          <w:rFonts w:ascii="Calibri" w:hAnsi="Calibri"/>
-          <w:b w:val="0"/>
-          <w:i w:val="0"/>
-          <w:sz w:val="22"/>
-        </w:rPr>
-        <w:tab/>
-      </w:r>
-      <w:r>
-        <w:rPr>
-          <w:rFonts w:ascii="Calibri" w:hAnsi="Calibri"/>
-          <w:b w:val="0"/>
-          <w:i w:val="0"/>
-          <w:sz w:val="22"/>
-        </w:rPr>
-        <w:t>2021 – present</w:t>
+        <w:t>PROFILE</w:t>
       </w:r>
     </w:p>
     <w:p>
@@ -143,147 +73,7 @@
           <w:i w:val="0"/>
           <w:sz w:val="22"/>
         </w:rPr>
-        <w:t>GPA: 8.98 / 10  (grading system: 0–10, minimum passing grade: 7)</w:t>
-      </w:r>
-    </w:p>
-    <w:p>
-      <w:pPr>
-        <w:tabs>
-          <w:tab w:val="right" w:pos="11030"/>
-        </w:tabs>
-        <w:spacing w:before="80" w:after="0" w:line="240" w:lineRule="exact"/>
-      </w:pPr>
-      <w:r>
-        <w:rPr>
-          <w:rFonts w:ascii="Calibri" w:hAnsi="Calibri"/>
-          <w:b/>
-          <w:i w:val="0"/>
-          <w:sz w:val="22"/>
-        </w:rPr>
-        <w:t>Google / Coursera</w:t>
-      </w:r>
-      <w:r>
-        <w:rPr>
-          <w:rFonts w:ascii="Calibri" w:hAnsi="Calibri"/>
-          <w:b w:val="0"/>
-          <w:i w:val="0"/>
-          <w:sz w:val="22"/>
-        </w:rPr>
-        <w:tab/>
-      </w:r>
-      <w:r>
-        <w:rPr>
-          <w:rFonts w:ascii="Calibri" w:hAnsi="Calibri"/>
-          <w:b w:val="0"/>
-          <w:i w:val="0"/>
-          <w:sz w:val="22"/>
-        </w:rPr>
-        <w:t>Online</w:t>
-      </w:r>
-    </w:p>
-    <w:p>
-      <w:pPr>
-        <w:tabs>
-          <w:tab w:val="right" w:pos="11030"/>
-        </w:tabs>
-        <w:spacing w:before="0" w:after="0" w:line="240" w:lineRule="exact"/>
-      </w:pPr>
-      <w:r>
-        <w:rPr>
-          <w:rFonts w:ascii="Calibri" w:hAnsi="Calibri"/>
-          <w:b w:val="0"/>
-          <w:i/>
-          <w:sz w:val="22"/>
-        </w:rPr>
-        <w:t>Professional Certificate in Cybersecurity</w:t>
-      </w:r>
-      <w:r>
-        <w:rPr>
-          <w:rFonts w:ascii="Calibri" w:hAnsi="Calibri"/>
-          <w:b w:val="0"/>
-          <w:i w:val="0"/>
-          <w:sz w:val="22"/>
-        </w:rPr>
-        <w:tab/>
-      </w:r>
-      <w:r>
-        <w:rPr>
-          <w:rFonts w:ascii="Calibri" w:hAnsi="Calibri"/>
-          <w:b w:val="0"/>
-          <w:i w:val="0"/>
-          <w:sz w:val="22"/>
-        </w:rPr>
-        <w:t>2025</w:t>
-      </w:r>
-    </w:p>
-    <w:p>
-      <w:pPr>
-        <w:tabs>
-          <w:tab w:val="right" w:pos="11030"/>
-        </w:tabs>
-        <w:spacing w:before="80" w:after="0" w:line="240" w:lineRule="exact"/>
-      </w:pPr>
-      <w:r>
-        <w:rPr>
-          <w:rFonts w:ascii="Calibri" w:hAnsi="Calibri"/>
-          <w:b/>
-          <w:i w:val="0"/>
-          <w:sz w:val="22"/>
-        </w:rPr>
-        <w:t>Google / Coursera</w:t>
-      </w:r>
-      <w:r>
-        <w:rPr>
-          <w:rFonts w:ascii="Calibri" w:hAnsi="Calibri"/>
-          <w:b w:val="0"/>
-          <w:i w:val="0"/>
-          <w:sz w:val="22"/>
-        </w:rPr>
-        <w:tab/>
-      </w:r>
-      <w:r>
-        <w:rPr>
-          <w:rFonts w:ascii="Calibri" w:hAnsi="Calibri"/>
-          <w:b w:val="0"/>
-          <w:i w:val="0"/>
-          <w:sz w:val="22"/>
-        </w:rPr>
-        <w:t>Online</w:t>
-      </w:r>
-    </w:p>
-    <w:p>
-      <w:pPr>
-        <w:tabs>
-          <w:tab w:val="right" w:pos="11030"/>
-        </w:tabs>
-        <w:spacing w:before="0" w:after="0" w:line="240" w:lineRule="exact"/>
-      </w:pPr>
-      <w:r>
-        <w:rPr>
-          <w:rFonts w:ascii="Calibri" w:hAnsi="Calibri"/>
-          <w:b w:val="0"/>
-          <w:i/>
-          <w:sz w:val="22"/>
-        </w:rPr>
-        <w:t>Professional Certificate in UX Design</w:t>
-      </w:r>
-      <w:r>
-        <w:rPr>
-          <w:rFonts w:ascii="Calibri" w:hAnsi="Calibri"/>
-          <w:b w:val="0"/>
-          <w:i w:val="0"/>
-          <w:sz w:val="22"/>
-        </w:rPr>
-        <w:tab/>
-      </w:r>
-      <w:r>
-        <w:rPr>
-          <w:rFonts w:ascii="Calibri" w:hAnsi="Calibri"/>
-          <w:b w:val="0"/>
-          <w:i w:val="0"/>
-          <w:sz w:val="22"/>
-        </w:rPr>
-        <w:t>2025 – in progress</w:t>
+        <w:t>Fullstack developer with systems running in production for real clients in Ecuador (clinical management, SRI e-invoicing, multi-branch inventory). Focused on Django/DRF and React/Next.js, with complementary training in cybersecurity.</w:t>
       </w:r>
     </w:p>
     <w:p>
@@ -371,7 +161,7 @@
           <w:i w:val="0"/>
           <w:sz w:val="22"/>
         </w:rPr>
-        <w:t>2024 – present</w:t>
+        <w:t>Feb 2026 – present</w:t>
       </w:r>
     </w:p>
     <w:p>
@@ -505,7 +295,7 @@
           <w:i w:val="0"/>
           <w:sz w:val="22"/>
         </w:rPr>
-        <w:t>2023 – present</w:t>
+        <w:t>Jul 2025 – present</w:t>
       </w:r>
     </w:p>
     <w:p>
@@ -639,7 +429,7 @@
           <w:i w:val="0"/>
           <w:sz w:val="22"/>
         </w:rPr>
-        <w:t>2025  (6 months)</w:t>
+        <w:t>Feb 2026 – Jul 2026</w:t>
       </w:r>
     </w:p>
     <w:p>
@@ -672,6 +462,318 @@
           <w:sz w:val="22"/>
         </w:rPr>
         <w:t>Automated internal registration and report-generation workflows using Python scripts.</w:t>
+      </w:r>
+    </w:p>
+    <w:p>
+      <w:pPr>
+        <w:spacing w:before="160" w:after="40" w:line="240" w:lineRule="exact"/>
+        <w:jc w:val="center"/>
+        <w:pBdr>
+          <w:bottom w:val="single" w:sz="4" w:space="1" w:color="000000"/>
+        </w:pBdr>
+      </w:pPr>
+      <w:r>
+        <w:rPr>
+          <w:rFonts w:ascii="Calibri" w:hAnsi="Calibri"/>
+          <w:b/>
+          <w:i w:val="0"/>
+          <w:sz w:val="22"/>
+        </w:rPr>
+        <w:t>EDUCATION</w:t>
+      </w:r>
+    </w:p>
+    <w:p>
+      <w:pPr>
+        <w:tabs>
+          <w:tab w:val="right" w:pos="11030"/>
+        </w:tabs>
+        <w:spacing w:before="80" w:after="0" w:line="240" w:lineRule="exact"/>
+      </w:pPr>
+      <w:r>
+        <w:rPr>
+          <w:rFonts w:ascii="Calibri" w:hAnsi="Calibri"/>
+          <w:b/>
+          <w:i w:val="0"/>
+          <w:sz w:val="22"/>
+        </w:rPr>
+        <w:t>University of Guayaquil</w:t>
+      </w:r>
+      <w:r>
+        <w:rPr>
+          <w:rFonts w:ascii="Calibri" w:hAnsi="Calibri"/>
+          <w:b w:val="0"/>
+          <w:i w:val="0"/>
+          <w:sz w:val="22"/>
+        </w:rPr>
+        <w:tab/>
+      </w:r>
+      <w:r>
+        <w:rPr>
+          <w:rFonts w:ascii="Calibri" w:hAnsi="Calibri"/>
+          <w:b w:val="0"/>
+          <w:i w:val="0"/>
+          <w:sz w:val="22"/>
+        </w:rPr>
+        <w:t>Guayaquil, Ecuador</w:t>
+      </w:r>
+    </w:p>
+    <w:p>
+      <w:pPr>
+        <w:tabs>
+          <w:tab w:val="right" w:pos="11030"/>
+        </w:tabs>
+        <w:spacing w:before="0" w:after="0" w:line="240" w:lineRule="exact"/>
+      </w:pPr>
+      <w:r>
+        <w:rPr>
+          <w:rFonts w:ascii="Calibri" w:hAnsi="Calibri"/>
+          <w:b w:val="0"/>
+          <w:i/>
+          <w:sz w:val="22"/>
+        </w:rPr>
+        <w:t>B.Sc. Software Engineering — 9th semester (of 10)</w:t>
+      </w:r>
+      <w:r>
+        <w:rPr>
+          <w:rFonts w:ascii="Calibri" w:hAnsi="Calibri"/>
+          <w:b w:val="0"/>
+          <w:i w:val="0"/>
+          <w:sz w:val="22"/>
+        </w:rPr>
+        <w:tab/>
+      </w:r>
+      <w:r>
+        <w:rPr>
+          <w:rFonts w:ascii="Calibri" w:hAnsi="Calibri"/>
+          <w:b w:val="0"/>
+          <w:i w:val="0"/>
+          <w:sz w:val="22"/>
+        </w:rPr>
+        <w:t>2021 – present</w:t>
+      </w:r>
+    </w:p>
+    <w:p>
+      <w:pPr>
+        <w:spacing w:before="0" w:after="0" w:line="240" w:lineRule="exact"/>
+      </w:pPr>
+      <w:r>
+        <w:rPr>
+          <w:rFonts w:ascii="Calibri" w:hAnsi="Calibri"/>
+          <w:b w:val="0"/>
+          <w:i w:val="0"/>
+          <w:sz w:val="22"/>
+        </w:rPr>
+        <w:t>GPA: 9.01 / 10  (grading system: 0–10, minimum passing grade: 7)</w:t>
+      </w:r>
+    </w:p>
+    <w:p>
+      <w:pPr>
+        <w:tabs>
+          <w:tab w:val="right" w:pos="11030"/>
+        </w:tabs>
+        <w:spacing w:before="80" w:after="0" w:line="240" w:lineRule="exact"/>
+      </w:pPr>
+      <w:r>
+        <w:rPr>
+          <w:rFonts w:ascii="Calibri" w:hAnsi="Calibri"/>
+          <w:b/>
+          <w:i w:val="0"/>
+          <w:sz w:val="22"/>
+        </w:rPr>
+        <w:t>Google / Coursera</w:t>
+      </w:r>
+      <w:r>
+        <w:rPr>
+          <w:rFonts w:ascii="Calibri" w:hAnsi="Calibri"/>
+          <w:b w:val="0"/>
+          <w:i w:val="0"/>
+          <w:sz w:val="22"/>
+        </w:rPr>
+        <w:tab/>
+      </w:r>
+      <w:r>
+        <w:rPr>
+          <w:rFonts w:ascii="Calibri" w:hAnsi="Calibri"/>
+          <w:b w:val="0"/>
+          <w:i w:val="0"/>
+          <w:sz w:val="22"/>
+        </w:rPr>
+        <w:t>Online</w:t>
+      </w:r>
+    </w:p>
+    <w:p>
+      <w:pPr>
+        <w:tabs>
+          <w:tab w:val="right" w:pos="11030"/>
+        </w:tabs>
+        <w:spacing w:before="0" w:after="0" w:line="240" w:lineRule="exact"/>
+      </w:pPr>
+      <w:r>
+        <w:rPr>
+          <w:rFonts w:ascii="Calibri" w:hAnsi="Calibri"/>
+          <w:b w:val="0"/>
+          <w:i/>
+          <w:sz w:val="22"/>
+        </w:rPr>
+        <w:t>Professional Certificate in Cybersecurity</w:t>
+      </w:r>
+      <w:r>
+        <w:rPr>
+          <w:rFonts w:ascii="Calibri" w:hAnsi="Calibri"/>
+          <w:b w:val="0"/>
+          <w:i w:val="0"/>
+          <w:sz w:val="22"/>
+        </w:rPr>
+        <w:tab/>
+      </w:r>
+      <w:r>
+        <w:rPr>
+          <w:rFonts w:ascii="Calibri" w:hAnsi="Calibri"/>
+          <w:b w:val="0"/>
+          <w:i w:val="0"/>
+          <w:sz w:val="22"/>
+        </w:rPr>
+        <w:t>2026 – in progress</w:t>
+      </w:r>
+    </w:p>
+    <w:p>
+      <w:pPr>
+        <w:tabs>
+          <w:tab w:val="right" w:pos="11030"/>
+        </w:tabs>
+        <w:spacing w:before="80" w:after="0" w:line="240" w:lineRule="exact"/>
+      </w:pPr>
+      <w:r>
+        <w:rPr>
+          <w:rFonts w:ascii="Calibri" w:hAnsi="Calibri"/>
+          <w:b/>
+          <w:i w:val="0"/>
+          <w:sz w:val="22"/>
+        </w:rPr>
+        <w:t>Google / Coursera</w:t>
+      </w:r>
+      <w:r>
+        <w:rPr>
+          <w:rFonts w:ascii="Calibri" w:hAnsi="Calibri"/>
+          <w:b w:val="0"/>
+          <w:i w:val="0"/>
+          <w:sz w:val="22"/>
+        </w:rPr>
+        <w:tab/>
+      </w:r>
+      <w:r>
+        <w:rPr>
+          <w:rFonts w:ascii="Calibri" w:hAnsi="Calibri"/>
+          <w:b w:val="0"/>
+          <w:i w:val="0"/>
+          <w:sz w:val="22"/>
+        </w:rPr>
+        <w:t>Online</w:t>
+      </w:r>
+    </w:p>
+    <w:p>
+      <w:pPr>
+        <w:tabs>
+          <w:tab w:val="right" w:pos="11030"/>
+        </w:tabs>
+        <w:spacing w:before="0" w:after="0" w:line="240" w:lineRule="exact"/>
+      </w:pPr>
+      <w:r>
+        <w:rPr>
+          <w:rFonts w:ascii="Calibri" w:hAnsi="Calibri"/>
+          <w:b w:val="0"/>
+          <w:i/>
+          <w:sz w:val="22"/>
+        </w:rPr>
+        <w:t>Professional Certificate in UX Design</w:t>
+      </w:r>
+      <w:r>
+        <w:rPr>
+          <w:rFonts w:ascii="Calibri" w:hAnsi="Calibri"/>
+          <w:b w:val="0"/>
+          <w:i w:val="0"/>
+          <w:sz w:val="22"/>
+        </w:rPr>
+        <w:tab/>
+      </w:r>
+      <w:r>
+        <w:rPr>
+          <w:rFonts w:ascii="Calibri" w:hAnsi="Calibri"/>
+          <w:b w:val="0"/>
+          <w:i w:val="0"/>
+          <w:sz w:val="22"/>
+        </w:rPr>
+        <w:t>2026 – in progress</w:t>
+      </w:r>
+    </w:p>
+    <w:p>
+      <w:pPr>
+        <w:tabs>
+          <w:tab w:val="right" w:pos="11030"/>
+        </w:tabs>
+        <w:spacing w:before="80" w:after="0" w:line="240" w:lineRule="exact"/>
+      </w:pPr>
+      <w:r>
+        <w:rPr>
+          <w:rFonts w:ascii="Calibri" w:hAnsi="Calibri"/>
+          <w:b/>
+          <w:i w:val="0"/>
+          <w:sz w:val="22"/>
+        </w:rPr>
+        <w:t>Hacker Mentor Cybersecurity Academy</w:t>
+      </w:r>
+      <w:r>
+        <w:rPr>
+          <w:rFonts w:ascii="Calibri" w:hAnsi="Calibri"/>
+          <w:b w:val="0"/>
+          <w:i w:val="0"/>
+          <w:sz w:val="22"/>
+        </w:rPr>
+        <w:tab/>
+      </w:r>
+      <w:r>
+        <w:rPr>
+          <w:rFonts w:ascii="Calibri" w:hAnsi="Calibri"/>
+          <w:b w:val="0"/>
+          <w:i w:val="0"/>
+          <w:sz w:val="22"/>
+        </w:rPr>
+        <w:t>Online</w:t>
+      </w:r>
+    </w:p>
+    <w:p>
+      <w:pPr>
+        <w:tabs>
+          <w:tab w:val="right" w:pos="11030"/>
+        </w:tabs>
+        <w:spacing w:before="0" w:after="0" w:line="240" w:lineRule="exact"/>
+      </w:pPr>
+      <w:r>
+        <w:rPr>
+          <w:rFonts w:ascii="Calibri" w:hAnsi="Calibri"/>
+          <w:b w:val="0"/>
+          <w:i/>
+          <w:sz w:val="22"/>
+        </w:rPr>
+        <w:t>Ethical Hacking — Red Team course (8 hours)</w:t>
+      </w:r>
+      <w:r>
+        <w:rPr>
+          <w:rFonts w:ascii="Calibri" w:hAnsi="Calibri"/>
+          <w:b w:val="0"/>
+          <w:i w:val="0"/>
+          <w:sz w:val="22"/>
+        </w:rPr>
+        <w:tab/>
+      </w:r>
+      <w:r>
+        <w:rPr>
+          <w:rFonts w:ascii="Calibri" w:hAnsi="Calibri"/>
+          <w:b w:val="0"/>
+          <w:i w:val="0"/>
+          <w:sz w:val="22"/>
+        </w:rPr>
+        <w:t>2023</w:t>
       </w:r>
     </w:p>
     <w:p>
@@ -945,7 +1047,7 @@
           <w:i/>
           <w:sz w:val="22"/>
         </w:rPr>
-        <w:t>AI-powered automated job application pipeline</w:t>
+        <w:t>Job posting aggregation and matching pipeline with LLMs</w:t>
       </w:r>
       <w:r>
         <w:rPr>
@@ -979,7 +1081,7 @@
           <w:i w:val="0"/>
           <w:sz w:val="22"/>
         </w:rPr>
-        <w:t>Automated scraping of 7 job boards, offer matching against candidate profile, and personalized cover letter generation with LLMs.</w:t>
+        <w:t>Built aggregation of 7 heterogeneous sources (JSON APIs, RSS, and HTML) normalized into a common schema, with headless Playwright for JS-rendered ones.</w:t>
       </w:r>
     </w:p>
     <w:p>
@@ -995,7 +1097,7 @@
           <w:i w:val="0"/>
           <w:sz w:val="22"/>
         </w:rPr>
-        <w:t>Implemented headless ATS auto-apply (Workable, Greenhouse, GetOnBrd) using Playwright.</w:t>
+        <w:t>Implemented semantic matching against the candidate profile and LLM text generation; reordering the prompt for prefix caching cut input tokens by ~80%.</w:t>
       </w:r>
     </w:p>
     <w:p>
@@ -1151,7 +1253,7 @@
           <w:i w:val="0"/>
           <w:sz w:val="22"/>
         </w:rPr>
-        <w:t>Kali Linux (active learning), Nmap, Wireshark</w:t>
+        <w:t>Kali Linux, Nmap, Wireshark, ethical hacking fundamentals</w:t>
       </w:r>
     </w:p>
     <w:p>

</xml_diff>

<commit_message>
cv: corregir stack de SimuladorPreguntas y Taller App
Verificado en los repos clonados:

- SimuladorPreguntas usa Express 5, no FastAPI. SimuladorPreguntasBackend
  no tiene requirements.txt ni codigo Python; su package.json declara
  express ^5.2.1. Se suma el despliegue en Docker multi-stage con usuario
  no-root detras de nginx.
- Taller App decia un generico "Node.js + React". El stack real es
  Express 5 + Sequelize + PDFKit + Nodemailer, con 5 suites de tests
  Jest + Supertest.

Regenerados cv_es y cv_en en docx y pdf.
</commit_message>
<xml_diff>
--- a/profile/cv_en.docx
+++ b/profile/cv_en.docx
@@ -359,7 +359,7 @@
           <w:i w:val="0"/>
           <w:sz w:val="22"/>
         </w:rPr>
-        <w:t>Implemented university exam simulator (React + FastAPI + PostgreSQL) with role-based access and anti-cheating measures.</w:t>
+        <w:t>Implemented university exam simulator (React + Express 5 + PostgreSQL) with role-based access, anti-cheating measures, and a multi-stage Docker deployment running as a non-root user behind nginx.</w:t>
       </w:r>
     </w:p>
     <w:p>
@@ -375,7 +375,7 @@
           <w:i w:val="0"/>
           <w:sz w:val="22"/>
         </w:rPr>
-        <w:t>Delivered Taller App: workshop management system (Node.js + React) for a freelance client.</w:t>
+        <w:t>Delivered Taller App: workshop management system (Express + Sequelize + PDFKit + React) with 5 Jest + Supertest suites.</w:t>
       </w:r>
     </w:p>
     <w:p>

</xml_diff>

<commit_message>
refactor(cv): leer los datos del candidato desde .env
generate_cv.py tenia nombre, ciudad, correo, telefono y enlaces escritos
en el codigo, en un repo publico.

- Los datos salen de CANDIDATE_*/GMAIL_USER, con CV_FULL_NAME para el
  nombre legal del encabezado (CANDIDATE_NAME puede ser la version corta).
- Los enlaces se imprimen sin esquema ni www, como antes.
- Falla con un assert si falta el nombre: un CV sin encabezado no debe
  llegar a una empresa.
- CV ES/EN regenerados; el encabezado sale identico al anterior.
</commit_message>
<xml_diff>
--- a/profile/cv_en.docx
+++ b/profile/cv_en.docx
@@ -1215,7 +1215,7 @@
           <w:i w:val="0"/>
           <w:sz w:val="22"/>
         </w:rPr>
-        <w:t>Built aggregation of 7 heterogeneous sources (JSON APIs, RSS, and HTML) normalized into a common schema, with headless Playwright for JS-rendered ones.</w:t>
+        <w:t>Built aggregation of 13 heterogeneous sources (JSON APIs, RSS, and HTML) normalized into a common schema, with headless Playwright for JS-rendered ones.</w:t>
       </w:r>
     </w:p>
     <w:p>
@@ -1231,7 +1231,7 @@
           <w:i w:val="0"/>
           <w:sz w:val="22"/>
         </w:rPr>
-        <w:t>Implemented semantic matching against the candidate profile and LLM text generation; reordering the prompt for prefix caching cut input tokens by ~80%.</w:t>
+        <w:t>Implemented profile matching and LLM text generation; reordering the prompt left 75% of it constant and cacheable as a prefix, with a regression test covering stack extraction.</w:t>
       </w:r>
     </w:p>
     <w:p>

</xml_diff>

<commit_message>
feat(cv): agregar Tech Lab de servidor web con GNU/Linux
Curso de 40 horas de la FCMF (jul-ago 2026): Ubuntu Server sobre VM,
SSH, UFW, permisos y stack LAMP. Se agrega en las versiones ES y EN
y se regeneran docx y pdf.
</commit_message>
<xml_diff>
--- a/profile/cv_en.docx
+++ b/profile/cv_en.docx
@@ -14,7 +14,7 @@
           <w:i w:val="0"/>
           <w:sz w:val="32"/>
         </w:rPr>
-        <w:t>Mickael Adrian Moran Vera</w:t>
+        <w:t>Mickaell Moran Vera</w:t>
       </w:r>
     </w:p>
     <w:p>
@@ -580,6 +580,90 @@
           <w:sz w:val="22"/>
         </w:rPr>
         <w:t>GPA: 9.01 / 10  (grading system: 0–10, minimum passing grade: 7)</w:t>
+      </w:r>
+    </w:p>
+    <w:p>
+      <w:pPr>
+        <w:tabs>
+          <w:tab w:val="right" w:pos="11030"/>
+        </w:tabs>
+        <w:spacing w:before="80" w:after="0" w:line="240" w:lineRule="exact"/>
+      </w:pPr>
+      <w:r>
+        <w:rPr>
+          <w:rFonts w:ascii="Calibri" w:hAnsi="Calibri"/>
+          <w:b/>
+          <w:i w:val="0"/>
+          <w:sz w:val="22"/>
+        </w:rPr>
+        <w:t>University of Guayaquil — FCMF</w:t>
+      </w:r>
+      <w:r>
+        <w:rPr>
+          <w:rFonts w:ascii="Calibri" w:hAnsi="Calibri"/>
+          <w:b w:val="0"/>
+          <w:i w:val="0"/>
+          <w:sz w:val="22"/>
+        </w:rPr>
+        <w:tab/>
+      </w:r>
+      <w:r>
+        <w:rPr>
+          <w:rFonts w:ascii="Calibri" w:hAnsi="Calibri"/>
+          <w:b w:val="0"/>
+          <w:i w:val="0"/>
+          <w:sz w:val="22"/>
+        </w:rPr>
+        <w:t>Guayaquil, Ecuador</w:t>
+      </w:r>
+    </w:p>
+    <w:p>
+      <w:pPr>
+        <w:tabs>
+          <w:tab w:val="right" w:pos="11030"/>
+        </w:tabs>
+        <w:spacing w:before="0" w:after="0" w:line="240" w:lineRule="exact"/>
+      </w:pPr>
+      <w:r>
+        <w:rPr>
+          <w:rFonts w:ascii="Calibri" w:hAnsi="Calibri"/>
+          <w:b w:val="0"/>
+          <w:i/>
+          <w:sz w:val="22"/>
+        </w:rPr>
+        <w:t>Tech Lab: Local Web Server with GNU/Linux (40 hours)</w:t>
+      </w:r>
+      <w:r>
+        <w:rPr>
+          <w:rFonts w:ascii="Calibri" w:hAnsi="Calibri"/>
+          <w:b w:val="0"/>
+          <w:i w:val="0"/>
+          <w:sz w:val="22"/>
+        </w:rPr>
+        <w:tab/>
+      </w:r>
+      <w:r>
+        <w:rPr>
+          <w:rFonts w:ascii="Calibri" w:hAnsi="Calibri"/>
+          <w:b w:val="0"/>
+          <w:i w:val="0"/>
+          <w:sz w:val="22"/>
+        </w:rPr>
+        <w:t>Aug. 2026</w:t>
+      </w:r>
+    </w:p>
+    <w:p>
+      <w:pPr>
+        <w:spacing w:before="0" w:after="0" w:line="240" w:lineRule="exact"/>
+      </w:pPr>
+      <w:r>
+        <w:rPr>
+          <w:rFonts w:ascii="Calibri" w:hAnsi="Calibri"/>
+          <w:b w:val="0"/>
+          <w:i w:val="0"/>
+          <w:sz w:val="22"/>
+        </w:rPr>
+        <w:t>Ubuntu Server on a VM, SSH, UFW, permissions and LAMP stack (Apache, PHP, MariaDB)</w:t>
       </w:r>
     </w:p>
     <w:p>

</xml_diff>